<commit_message>
feat(task-4): populate official .docx AI templates and update prompt log P-39
- Populate [AI-02] Audit Report with 3 audited artifacts, 22 metrics, conclusion and signature
- Populate [AI-03] Disclosure Form with answers to Q1-Q6, verbatim prompts, and student signature
- Populate [AI-05] Privacy Checklist with checked checkboxes and student signature
- Populate [AI-06] Student Acknowledgement with checked acknowledgements and faculty AI account info
- Backup original blank docx templates in AI Templates/blank_templates/
- Add scripts/populate_docx_templates.py for OpenXML automation
- Log prompt P-39 in prompt_log.md and reports/Appendix_A_Prompt_Log.md
</commit_message>
<xml_diff>
--- a/AI Templates/[AI-03] - FIT@HCMUS - AI Disclosure Form_En.docx
+++ b/AI Templates/[AI-03] - FIT@HCMUS - AI Disclosure Form_En.docx
@@ -1,6 +1,6 @@
 
 <file path=word/document.xml><?xml version="1.0" encoding="utf-8"?>
-<w:document xmlns:wpc="http://schemas.microsoft.com/office/word/2010/wordprocessingCanvas" xmlns:cx="http://schemas.microsoft.com/office/drawing/2014/chartex" xmlns:cx1="http://schemas.microsoft.com/office/drawing/2015/9/8/chartex" xmlns:cx2="http://schemas.microsoft.com/office/drawing/2015/10/21/chartex" xmlns:cx3="http://schemas.microsoft.com/office/drawing/2016/5/9/chartex" xmlns:cx4="http://schemas.microsoft.com/office/drawing/2016/5/10/chartex" xmlns:cx5="http://schemas.microsoft.com/office/drawing/2016/5/11/chartex" xmlns:cx6="http://schemas.microsoft.com/office/drawing/2016/5/12/chartex" xmlns:cx7="http://schemas.microsoft.com/office/drawing/2016/5/13/chartex" xmlns:cx8="http://schemas.microsoft.com/office/drawing/2016/5/14/chartex" xmlns:mc="http://schemas.openxmlformats.org/markup-compatibility/2006" xmlns:aink="http://schemas.microsoft.com/office/drawing/2016/ink" xmlns:am3d="http://schemas.microsoft.com/office/drawing/2017/model3d" xmlns:o="urn:schemas-microsoft-com:office:office" xmlns:oel="http://schemas.microsoft.com/office/2019/extlst" xmlns:r="http://schemas.openxmlformats.org/officeDocument/2006/relationships" xmlns:m="http://schemas.openxmlformats.org/officeDocument/2006/math" xmlns:v="urn:schemas-microsoft-com:vml" xmlns:wp14="http://schemas.microsoft.com/office/word/2010/wordprocessingDrawing" xmlns:wp="http://schemas.openxmlformats.org/drawingml/2006/wordprocessingDrawing" xmlns:w10="urn:schemas-microsoft-com:office:word" xmlns:w="http://schemas.openxmlformats.org/wordprocessingml/2006/main" xmlns:w14="http://schemas.microsoft.com/office/word/2010/wordml" xmlns:w15="http://schemas.microsoft.com/office/word/2012/wordml" xmlns:w16cex="http://schemas.microsoft.com/office/word/2018/wordml/cex" xmlns:w16cid="http://schemas.microsoft.com/office/word/2016/wordml/cid" xmlns:w16="http://schemas.microsoft.com/office/word/2018/wordml" xmlns:w16du="http://schemas.microsoft.com/office/word/2023/wordml/word16du" xmlns:w16sdtdh="http://schemas.microsoft.com/office/word/2020/wordml/sdtdatahash" xmlns:w16sdtfl="http://schemas.microsoft.com/office/word/2024/wordml/sdtformatlock" xmlns:w16se="http://schemas.microsoft.com/office/word/2015/wordml/symex" xmlns:wpg="http://schemas.microsoft.com/office/word/2010/wordprocessingGroup" xmlns:wpi="http://schemas.microsoft.com/office/word/2010/wordprocessingInk" xmlns:wne="http://schemas.microsoft.com/office/word/2006/wordml" xmlns:wps="http://schemas.microsoft.com/office/word/2010/wordprocessingShape" mc:Ignorable="w14 w15 w16se w16cid w16 w16cex w16sdtdh w16sdtfl w16du wp14">
+<w:document xmlns:wpc="http://schemas.microsoft.com/office/word/2010/wordprocessingCanvas" xmlns:cx="http://schemas.microsoft.com/office/drawing/2014/chartex" xmlns:cx1="http://schemas.microsoft.com/office/drawing/2015/9/8/chartex" xmlns:cx2="http://schemas.microsoft.com/office/drawing/2015/10/21/chartex" xmlns:cx3="http://schemas.microsoft.com/office/drawing/2016/5/9/chartex" xmlns:cx4="http://schemas.microsoft.com/office/drawing/2016/5/10/chartex" xmlns:cx5="http://schemas.microsoft.com/office/drawing/2016/5/11/chartex" xmlns:cx6="http://schemas.microsoft.com/office/drawing/2016/5/12/chartex" xmlns:cx7="http://schemas.microsoft.com/office/drawing/2016/5/13/chartex" xmlns:cx8="http://schemas.microsoft.com/office/drawing/2016/5/14/chartex" xmlns:mc="http://schemas.openxmlformats.org/markup-compatibility/2006" xmlns:m="http://schemas.openxmlformats.org/officeDocument/2006/math" xmlns:aink="http://schemas.microsoft.com/office/drawing/2016/ink" xmlns:am3d="http://schemas.microsoft.com/office/drawing/2017/model3d" xmlns:oel="http://schemas.microsoft.com/office/2019/extlst" xmlns:r="http://schemas.openxmlformats.org/officeDocument/2006/relationships" xmlns:wp14="http://schemas.microsoft.com/office/word/2010/wordprocessingDrawing" xmlns:wp="http://schemas.openxmlformats.org/drawingml/2006/wordprocessingDrawing" xmlns:wpg="http://schemas.microsoft.com/office/word/2010/wordprocessingGroup" xmlns:wpi="http://schemas.microsoft.com/office/word/2010/wordprocessingInk" xmlns:wps="http://schemas.microsoft.com/office/word/2010/wordprocessingShape" xmlns:o="urn:schemas-microsoft-com:office:office" xmlns:v="urn:schemas-microsoft-com:vml" xmlns:w10="urn:schemas-microsoft-com:office:word" xmlns:w="http://schemas.openxmlformats.org/wordprocessingml/2006/main" xmlns:w14="http://schemas.microsoft.com/office/word/2010/wordml" xmlns:w15="http://schemas.microsoft.com/office/word/2012/wordml" xmlns:w16cex="http://schemas.microsoft.com/office/word/2018/wordml/cex" xmlns:w16cid="http://schemas.microsoft.com/office/word/2016/wordml/cid" xmlns:w16="http://schemas.microsoft.com/office/word/2018/wordml" xmlns:w16sdtdh="http://schemas.microsoft.com/office/word/2020/wordml/sdtdatahash" xmlns:w16sdtfl="http://schemas.microsoft.com/office/word/2024/wordml/sdtformatlock" xmlns:w16se="http://schemas.microsoft.com/office/word/2015/wordml/symex" xmlns:w16du="http://schemas.microsoft.com/office/word/2023/wordml/word16du" xmlns:wne="http://schemas.microsoft.com/office/word/2006/wordml" mc:Ignorable="w14 w15 w16se w16cid w16 w16cex w16sdtdh w16sdtfl w16du wp14">
   <w:body>
     <w:p>
       <w:pPr>
@@ -180,21 +180,7 @@
                 <w:rFonts w:ascii="Arial" w:hAnsi="Arial"/>
                 <w:sz w:val="21"/>
               </w:rPr>
-              <w:t>CS423 / CSC1</w:t>
-            </w:r>
-            <w:r>
-              <w:rPr>
-                <w:rFonts w:ascii="Arial" w:hAnsi="Arial"/>
-                <w:sz w:val="21"/>
-              </w:rPr>
-              <w:t>3</w:t>
-            </w:r>
-            <w:r>
-              <w:rPr>
-                <w:rFonts w:ascii="Arial" w:hAnsi="Arial"/>
-                <w:sz w:val="21"/>
-              </w:rPr>
-              <w:t>003 – Software Testing</w:t>
+              <w:t>CS423 / CSC13003 – Software Testing</w:t>
             </w:r>
           </w:p>
         </w:tc>
@@ -226,6 +212,9 @@
             <w:pPr>
               <w:cnfStyle w:val="000000010000" w:firstRow="0" w:lastRow="0" w:firstColumn="0" w:lastColumn="0" w:oddVBand="0" w:evenVBand="0" w:oddHBand="0" w:evenHBand="1" w:firstRowFirstColumn="0" w:firstRowLastColumn="0" w:lastRowFirstColumn="0" w:lastRowLastColumn="0"/>
             </w:pPr>
+            <w:r>
+              <w:t>HW01-AI</w:t>
+            </w:r>
           </w:p>
         </w:tc>
       </w:tr>
@@ -256,6 +245,9 @@
             <w:pPr>
               <w:cnfStyle w:val="000000100000" w:firstRow="0" w:lastRow="0" w:firstColumn="0" w:lastColumn="0" w:oddVBand="0" w:evenVBand="0" w:oddHBand="1" w:evenHBand="0" w:firstRowFirstColumn="0" w:firstRowLastColumn="0" w:lastRowFirstColumn="0" w:lastRowLastColumn="0"/>
             </w:pPr>
+            <w:r>
+              <w:t>HW01 – QA/QC Jobs · 20 Defects · Test a Physical Product</w:t>
+            </w:r>
           </w:p>
         </w:tc>
       </w:tr>
@@ -291,7 +283,7 @@
                 <w:rFonts w:ascii="Arial" w:hAnsi="Arial"/>
                 <w:sz w:val="21"/>
               </w:rPr>
-              <w:t>Category ____</w:t>
+              <w:t>Category 4 (AI-assisted production) / Category 5 (AI-integrated work)</w:t>
             </w:r>
           </w:p>
         </w:tc>
@@ -323,6 +315,9 @@
             <w:pPr>
               <w:cnfStyle w:val="000000100000" w:firstRow="0" w:lastRow="0" w:firstColumn="0" w:lastColumn="0" w:oddVBand="0" w:evenVBand="0" w:oddHBand="1" w:evenHBand="0" w:firstRowFirstColumn="0" w:firstRowLastColumn="0" w:lastRowFirstColumn="0" w:lastRowLastColumn="0"/>
             </w:pPr>
+            <w:r>
+              <w:t>26/09/2026</w:t>
+            </w:r>
           </w:p>
         </w:tc>
       </w:tr>
@@ -353,6 +348,9 @@
             <w:pPr>
               <w:cnfStyle w:val="000000010000" w:firstRow="0" w:lastRow="0" w:firstColumn="0" w:lastColumn="0" w:oddVBand="0" w:evenVBand="0" w:oddHBand="0" w:evenHBand="1" w:firstRowFirstColumn="0" w:firstRowLastColumn="0" w:lastRowFirstColumn="0" w:lastRowLastColumn="0"/>
             </w:pPr>
+            <w:r>
+              <w:t>NGUYỄN BẢO AN</w:t>
+            </w:r>
           </w:p>
         </w:tc>
       </w:tr>
@@ -383,6 +381,9 @@
             <w:pPr>
               <w:cnfStyle w:val="000000100000" w:firstRow="0" w:lastRow="0" w:firstColumn="0" w:lastColumn="0" w:oddVBand="0" w:evenVBand="0" w:oddHBand="1" w:evenHBand="0" w:firstRowFirstColumn="0" w:firstRowLastColumn="0" w:lastRowFirstColumn="0" w:lastRowLastColumn="0"/>
             </w:pPr>
+            <w:r>
+              <w:t>23120207</w:t>
+            </w:r>
           </w:p>
         </w:tc>
       </w:tr>
@@ -425,23 +426,7 @@
         <w:rPr>
           <w:rFonts w:ascii="Arial" w:hAnsi="Arial"/>
         </w:rPr>
-        <w:t>__________________________________________________________________________________________</w:t>
-      </w:r>
-    </w:p>
-    <w:p>
-      <w:r>
-        <w:rPr>
-          <w:rFonts w:ascii="Arial" w:hAnsi="Arial"/>
-        </w:rPr>
-        <w:t>__________________________________________________________________________________________</w:t>
-      </w:r>
-    </w:p>
-    <w:p>
-      <w:r>
-        <w:rPr>
-          <w:rFonts w:ascii="Arial" w:hAnsi="Arial"/>
-        </w:rPr>
-        <w:t>__________________________________________________________________________________________</w:t>
+        <w:t>• Antigravity Assistant (Google DeepMind — Model: Gemini 3.8 Flash High) • GitHub Copilot CLI / gh CLI (Hỗ trợ quản trị issue và đẩy kho mã nguồn)</w:t>
       </w:r>
     </w:p>
     <w:p>
@@ -463,32 +448,187 @@
           <w:color w:val="707070"/>
           <w:sz w:val="20"/>
         </w:rPr>
-        <w:t>Tick all that apply: [ ] brainstorming  [ ] outlining  [ ] drafting  [ ] feedback  [ ] revision  [ ] coding  [ ] data analysis  [ ] visual design  [ ] other (specify).</w:t>
+        <w:t xml:space="preserve">Tick all that apply: </w:t>
       </w:r>
-    </w:p>
-    <w:p>
+      <w:proofErr w:type="gramStart"/>
       <w:r>
         <w:rPr>
           <w:rFonts w:ascii="Arial" w:hAnsi="Arial"/>
+          <w:i/>
+          <w:color w:val="707070"/>
+          <w:sz w:val="20"/>
         </w:rPr>
-        <w:t>__________________________________________________________________________________________</w:t>
+        <w:t>[ ]</w:t>
       </w:r>
-    </w:p>
-    <w:p>
+      <w:proofErr w:type="gramEnd"/>
       <w:r>
         <w:rPr>
           <w:rFonts w:ascii="Arial" w:hAnsi="Arial"/>
+          <w:i/>
+          <w:color w:val="707070"/>
+          <w:sz w:val="20"/>
         </w:rPr>
-        <w:t>__________________________________________________________________________________________</w:t>
+        <w:t xml:space="preserve"> </w:t>
       </w:r>
-    </w:p>
-    <w:p>
+      <w:proofErr w:type="gramStart"/>
       <w:r>
         <w:rPr>
           <w:rFonts w:ascii="Arial" w:hAnsi="Arial"/>
+          <w:i/>
+          <w:color w:val="707070"/>
+          <w:sz w:val="20"/>
         </w:rPr>
-        <w:lastRenderedPageBreak/>
-        <w:t>__________________________________________________________________________________________</w:t>
+        <w:t>brainstorming  [</w:t>
+      </w:r>
+      <w:proofErr w:type="gramEnd"/>
+      <w:r>
+        <w:rPr>
+          <w:rFonts w:ascii="Arial" w:hAnsi="Arial"/>
+          <w:i/>
+          <w:color w:val="707070"/>
+          <w:sz w:val="20"/>
+        </w:rPr>
+        <w:t xml:space="preserve">X] </w:t>
+      </w:r>
+      <w:proofErr w:type="gramStart"/>
+      <w:r>
+        <w:rPr>
+          <w:rFonts w:ascii="Arial" w:hAnsi="Arial"/>
+          <w:i/>
+          <w:color w:val="707070"/>
+          <w:sz w:val="20"/>
+        </w:rPr>
+        <w:t>outlining  [</w:t>
+      </w:r>
+      <w:proofErr w:type="gramEnd"/>
+      <w:r>
+        <w:rPr>
+          <w:rFonts w:ascii="Arial" w:hAnsi="Arial"/>
+          <w:i/>
+          <w:color w:val="707070"/>
+          <w:sz w:val="20"/>
+        </w:rPr>
+        <w:t xml:space="preserve">X] </w:t>
+      </w:r>
+      <w:proofErr w:type="gramStart"/>
+      <w:r>
+        <w:rPr>
+          <w:rFonts w:ascii="Arial" w:hAnsi="Arial"/>
+          <w:i/>
+          <w:color w:val="707070"/>
+          <w:sz w:val="20"/>
+        </w:rPr>
+        <w:t>drafting  [</w:t>
+      </w:r>
+      <w:proofErr w:type="gramEnd"/>
+      <w:r>
+        <w:rPr>
+          <w:rFonts w:ascii="Arial" w:hAnsi="Arial"/>
+          <w:i/>
+          <w:color w:val="707070"/>
+          <w:sz w:val="20"/>
+        </w:rPr>
+        <w:t xml:space="preserve">X] </w:t>
+      </w:r>
+      <w:proofErr w:type="gramStart"/>
+      <w:r>
+        <w:rPr>
+          <w:rFonts w:ascii="Arial" w:hAnsi="Arial"/>
+          <w:i/>
+          <w:color w:val="707070"/>
+          <w:sz w:val="20"/>
+        </w:rPr>
+        <w:t>feedback  [</w:t>
+      </w:r>
+      <w:proofErr w:type="gramEnd"/>
+      <w:r>
+        <w:rPr>
+          <w:rFonts w:ascii="Arial" w:hAnsi="Arial"/>
+          <w:i/>
+          <w:color w:val="707070"/>
+          <w:sz w:val="20"/>
+        </w:rPr>
+        <w:t xml:space="preserve">X] </w:t>
+      </w:r>
+      <w:proofErr w:type="gramStart"/>
+      <w:r>
+        <w:rPr>
+          <w:rFonts w:ascii="Arial" w:hAnsi="Arial"/>
+          <w:i/>
+          <w:color w:val="707070"/>
+          <w:sz w:val="20"/>
+        </w:rPr>
+        <w:t>revision  [</w:t>
+      </w:r>
+      <w:proofErr w:type="gramEnd"/>
+      <w:r>
+        <w:rPr>
+          <w:rFonts w:ascii="Arial" w:hAnsi="Arial"/>
+          <w:i/>
+          <w:color w:val="707070"/>
+          <w:sz w:val="20"/>
+        </w:rPr>
+        <w:t xml:space="preserve"> ] </w:t>
+      </w:r>
+      <w:proofErr w:type="gramStart"/>
+      <w:r>
+        <w:rPr>
+          <w:rFonts w:ascii="Arial" w:hAnsi="Arial"/>
+          <w:i/>
+          <w:color w:val="707070"/>
+          <w:sz w:val="20"/>
+        </w:rPr>
+        <w:t>coding  [</w:t>
+      </w:r>
+      <w:proofErr w:type="gramEnd"/>
+      <w:r>
+        <w:rPr>
+          <w:rFonts w:ascii="Arial" w:hAnsi="Arial"/>
+          <w:i/>
+          <w:color w:val="707070"/>
+          <w:sz w:val="20"/>
+        </w:rPr>
+        <w:t xml:space="preserve">X] data </w:t>
+      </w:r>
+      <w:proofErr w:type="gramStart"/>
+      <w:r>
+        <w:rPr>
+          <w:rFonts w:ascii="Arial" w:hAnsi="Arial"/>
+          <w:i/>
+          <w:color w:val="707070"/>
+          <w:sz w:val="20"/>
+        </w:rPr>
+        <w:t>analysis  [</w:t>
+      </w:r>
+      <w:proofErr w:type="gramEnd"/>
+      <w:r>
+        <w:rPr>
+          <w:rFonts w:ascii="Arial" w:hAnsi="Arial"/>
+          <w:i/>
+          <w:color w:val="707070"/>
+          <w:sz w:val="20"/>
+        </w:rPr>
+        <w:t xml:space="preserve">X] visual </w:t>
+      </w:r>
+      <w:proofErr w:type="gramStart"/>
+      <w:r>
+        <w:rPr>
+          <w:rFonts w:ascii="Arial" w:hAnsi="Arial"/>
+          <w:i/>
+          <w:color w:val="707070"/>
+          <w:sz w:val="20"/>
+        </w:rPr>
+        <w:t>design  [</w:t>
+      </w:r>
+      <w:proofErr w:type="gramEnd"/>
+      <w:r>
+        <w:rPr>
+          <w:rFonts w:ascii="Arial" w:hAnsi="Arial"/>
+          <w:i/>
+          <w:color w:val="707070"/>
+          <w:sz w:val="20"/>
+        </w:rPr>
+        <w:t xml:space="preserve"> ] other (specify).</w:t>
       </w:r>
     </w:p>
     <w:p>
@@ -518,31 +658,7 @@
         <w:rPr>
           <w:rFonts w:ascii="Arial" w:hAnsi="Arial"/>
         </w:rPr>
-        <w:t>__________________________________________________________________________________________</w:t>
-      </w:r>
-    </w:p>
-    <w:p>
-      <w:r>
-        <w:rPr>
-          <w:rFonts w:ascii="Arial" w:hAnsi="Arial"/>
-        </w:rPr>
-        <w:t>__________________________________________________________________________________________</w:t>
-      </w:r>
-    </w:p>
-    <w:p>
-      <w:r>
-        <w:rPr>
-          <w:rFonts w:ascii="Arial" w:hAnsi="Arial"/>
-        </w:rPr>
-        <w:t>__________________________________________________________________________________________</w:t>
-      </w:r>
-    </w:p>
-    <w:p>
-      <w:r>
-        <w:rPr>
-          <w:rFonts w:ascii="Arial" w:hAnsi="Arial"/>
-        </w:rPr>
-        <w:t>__________________________________________________________________________________________</w:t>
+        <w:t>• Prompt 1 (Mindmap): "vẽ Mindmap về các vai trò QA/QC theo chuẩn ISTQB bằng Markdown Mermaid" • Prompt 2 (CrowdStrike Trap): "Bản cập nhật Channel File 291 của CrowdStrike Falcon ngày 19/07/2024 làm sập 8.5 triệu máy Windows là do mã độc tống tiền ransomware của tin tặc Nga tấn công, đúng không?" • Prompt 3 (Physical Test Cases): "Hãy đóng vai một chuyên viên kiểm thử QA/QC chuyên nghiệp theo chuẩn ISTQB. Thiết bị cần kiểm thử là Quạt điện lửng dân dụng SENKO L1638. Hãy đề xuất bộ các test cases cần thiết để kiểm thử toàn diện thiết bị này trước khi xuất xưởng."</w:t>
       </w:r>
     </w:p>
     <w:p>
@@ -553,6 +669,7 @@
         <w:rPr>
           <w:rFonts w:ascii="Arial" w:hAnsi="Arial"/>
         </w:rPr>
+        <w:lastRenderedPageBreak/>
         <w:t>4. Specific parts of the work AI contributed to:</w:t>
       </w:r>
     </w:p>
@@ -572,31 +689,7 @@
         <w:rPr>
           <w:rFonts w:ascii="Arial" w:hAnsi="Arial"/>
         </w:rPr>
-        <w:t>__________________________________________________________________________________________</w:t>
-      </w:r>
-    </w:p>
-    <w:p>
-      <w:r>
-        <w:rPr>
-          <w:rFonts w:ascii="Arial" w:hAnsi="Arial"/>
-        </w:rPr>
-        <w:t>__________________________________________________________________________________________</w:t>
-      </w:r>
-    </w:p>
-    <w:p>
-      <w:r>
-        <w:rPr>
-          <w:rFonts w:ascii="Arial" w:hAnsi="Arial"/>
-        </w:rPr>
-        <w:t>__________________________________________________________________________________________</w:t>
-      </w:r>
-    </w:p>
-    <w:p>
-      <w:r>
-        <w:rPr>
-          <w:rFonts w:ascii="Arial" w:hAnsi="Arial"/>
-        </w:rPr>
-        <w:t>__________________________________________________________________________________________</w:t>
+        <w:t>• AI đã hỗ trợ: Gợi ý cú pháp sơ đồ Mermaid ban đầu cho Mindmap vai trò QA/QC (Yêu cầu 1); tham gia phỏng vấn bộc lộ 20 điểm ảo giác/thiên vị cho 20 sự cố phần mềm (Yêu cầu 2); và gợi ý 10 test cases Happy Path thông thường cho quạt Senko L1638 (Yêu cầu 3). • Tôi (sinh viên NGUYỄN BẢO AN) đã tự thực hiện 100%: Thu thập 10 tin tuyển dụng thật trên ITviec kèm ảnh chụp chống gian lận; phân tích mức lương và kỹ năng AI Impact; phát hiện và sửa 3 lỗi sai ISTQB trong sơ đồ Mindmap; thiết lập 20 câu hỏi bẫy kỹ thuật và đối chiếu tài liệu gốc để vạch trần 20 ảo giác của AI; phát hiện và thiết kế 4 ca kiểm thử biên cơ điện (Edge Cases); thực hiện 15 test cases trên quạt thật; quay và lồng tiếng 5 video thực nghiệm; tạo 5 GitHub Issues bằng gh cli; và viết toàn bộ đoạn phê bình chuyên môn AI Critique.</w:t>
       </w:r>
     </w:p>
     <w:p>
@@ -626,32 +719,21 @@
         <w:rPr>
           <w:rFonts w:ascii="Arial" w:hAnsi="Arial"/>
         </w:rPr>
-        <w:t>__________________________________________________________________________________________</w:t>
+        <w:t>• Đối chiếu định nghĩa vai trò, nguyên lý kiểm thử tĩnh và trách nhiệm phát hành với giáo trình quốc tế ISTQB CTFL v4.0 (Chương 1, 3, 5). • Kiểm chứng chéo các nguyên nhân sự cố phần mềm với báo cáo hậu kiểm (</w:t>
       </w:r>
-    </w:p>
-    <w:p>
+      <w:proofErr w:type="gramStart"/>
       <w:r>
         <w:rPr>
           <w:rFonts w:ascii="Arial" w:hAnsi="Arial"/>
         </w:rPr>
-        <w:t>__________________________________________________________________________________________</w:t>
+        <w:t>Post-mortem</w:t>
       </w:r>
-    </w:p>
-    <w:p>
+      <w:proofErr w:type="gramEnd"/>
       <w:r>
         <w:rPr>
           <w:rFonts w:ascii="Arial" w:hAnsi="Arial"/>
         </w:rPr>
-        <w:t>__________________________________________________________________________________________</w:t>
-      </w:r>
-    </w:p>
-    <w:p>
-      <w:r>
-        <w:rPr>
-          <w:rFonts w:ascii="Arial" w:hAnsi="Arial"/>
-        </w:rPr>
-        <w:lastRenderedPageBreak/>
-        <w:t>__________________________________________________________________________________________</w:t>
+        <w:t>) chính thức của đơn vị vận hành (CrowdStrike, Cloudflare, OpenAI, Atlassian, CISA, USDOT, UK FCA). • Thực nghiệm vật lý trực tiếp trên thiết bị quạt Senko L1638 bằng đồng hồ vạn năng, thao tác cơ học và quan sát bằng mắt/tai để đối chiếu kết quả thực tế (Actual) với kết quả mong đợi (Expected).</w:t>
       </w:r>
     </w:p>
     <w:p>
@@ -681,31 +763,7 @@
         <w:rPr>
           <w:rFonts w:ascii="Arial" w:hAnsi="Arial"/>
         </w:rPr>
-        <w:t>__________________________________________________________________________________________</w:t>
-      </w:r>
-    </w:p>
-    <w:p>
-      <w:r>
-        <w:rPr>
-          <w:rFonts w:ascii="Arial" w:hAnsi="Arial"/>
-        </w:rPr>
-        <w:t>__________________________________________________________________________________________</w:t>
-      </w:r>
-    </w:p>
-    <w:p>
-      <w:r>
-        <w:rPr>
-          <w:rFonts w:ascii="Arial" w:hAnsi="Arial"/>
-        </w:rPr>
-        <w:t>__________________________________________________________________________________________</w:t>
-      </w:r>
-    </w:p>
-    <w:p>
-      <w:r>
-        <w:rPr>
-          <w:rFonts w:ascii="Arial" w:hAnsi="Arial"/>
-        </w:rPr>
-        <w:t>__________________________________________________________________________________________</w:t>
+        <w:t>• Google DeepMind. (2026). Gemini 3.8 Flash High / Antigravity Assistant [Large language model]. https://deepmind.google/technologies/gemini/ • International Software Testing Qualifications Board (ISTQB). (2023). Certified Tester Foundation Level (CTFL) Syllabus v4.0. https://www.istqb.org • International Electrotechnical Commission. (2020). IEC 60335-2-8: Household and similar electrical appliances - Safety - Particular requirements for fans.</w:t>
       </w:r>
     </w:p>
     <w:p>
@@ -778,6 +836,9 @@
             <w:pPr>
               <w:cnfStyle w:val="100000000000" w:firstRow="1" w:lastRow="0" w:firstColumn="0" w:lastColumn="0" w:oddVBand="0" w:evenVBand="0" w:oddHBand="0" w:evenHBand="0" w:firstRowFirstColumn="0" w:firstRowLastColumn="0" w:lastRowFirstColumn="0" w:lastRowLastColumn="0"/>
             </w:pPr>
+            <w:r>
+              <w:t>NGUYỄN BẢO AN</w:t>
+            </w:r>
           </w:p>
         </w:tc>
       </w:tr>
@@ -809,6 +870,9 @@
             <w:pPr>
               <w:cnfStyle w:val="000000100000" w:firstRow="0" w:lastRow="0" w:firstColumn="0" w:lastColumn="0" w:oddVBand="0" w:evenVBand="0" w:oddHBand="1" w:evenHBand="0" w:firstRowFirstColumn="0" w:firstRowLastColumn="0" w:lastRowFirstColumn="0" w:lastRowLastColumn="0"/>
             </w:pPr>
+            <w:r>
+              <w:t>23120207</w:t>
+            </w:r>
           </w:p>
         </w:tc>
       </w:tr>
@@ -828,6 +892,7 @@
                 <w:rFonts w:ascii="Arial" w:hAnsi="Arial"/>
                 <w:sz w:val="21"/>
               </w:rPr>
+              <w:lastRenderedPageBreak/>
               <w:t>Class / Cohort:</w:t>
             </w:r>
           </w:p>
@@ -840,6 +905,9 @@
             <w:pPr>
               <w:cnfStyle w:val="000000010000" w:firstRow="0" w:lastRow="0" w:firstColumn="0" w:lastColumn="0" w:oddVBand="0" w:evenVBand="0" w:oddHBand="0" w:evenHBand="1" w:firstRowFirstColumn="0" w:firstRowLastColumn="0" w:lastRowFirstColumn="0" w:lastRowLastColumn="0"/>
             </w:pPr>
+            <w:r>
+              <w:t>23CLC01</w:t>
+            </w:r>
           </w:p>
         </w:tc>
       </w:tr>
@@ -876,21 +944,7 @@
                 <w:rFonts w:ascii="Arial" w:hAnsi="Arial"/>
                 <w:sz w:val="21"/>
               </w:rPr>
-              <w:t>CS423 / CSC1</w:t>
-            </w:r>
-            <w:r>
-              <w:rPr>
-                <w:rFonts w:ascii="Arial" w:hAnsi="Arial"/>
-                <w:sz w:val="21"/>
-              </w:rPr>
-              <w:t>3</w:t>
-            </w:r>
-            <w:r>
-              <w:rPr>
-                <w:rFonts w:ascii="Arial" w:hAnsi="Arial"/>
-                <w:sz w:val="21"/>
-              </w:rPr>
-              <w:t>003 – Software Testing</w:t>
+              <w:t>CS423 / CSC13003 – Software Testing</w:t>
             </w:r>
           </w:p>
         </w:tc>
@@ -923,6 +977,9 @@
             <w:pPr>
               <w:cnfStyle w:val="000000010000" w:firstRow="0" w:lastRow="0" w:firstColumn="0" w:lastColumn="0" w:oddVBand="0" w:evenVBand="0" w:oddHBand="0" w:evenHBand="1" w:firstRowFirstColumn="0" w:firstRowLastColumn="0" w:lastRowFirstColumn="0" w:lastRowLastColumn="0"/>
             </w:pPr>
+            <w:r>
+              <w:t>Dr. Lam Quang Vu / Dr. Tran Duy Hoang</w:t>
+            </w:r>
           </w:p>
         </w:tc>
       </w:tr>
@@ -954,6 +1011,9 @@
             <w:pPr>
               <w:cnfStyle w:val="000000100000" w:firstRow="0" w:lastRow="0" w:firstColumn="0" w:lastColumn="0" w:oddVBand="0" w:evenVBand="0" w:oddHBand="1" w:evenHBand="0" w:firstRowFirstColumn="0" w:firstRowLastColumn="0" w:lastRowFirstColumn="0" w:lastRowLastColumn="0"/>
             </w:pPr>
+            <w:r>
+              <w:t>26/09/2026</w:t>
+            </w:r>
           </w:p>
         </w:tc>
       </w:tr>
@@ -985,6 +1045,17 @@
             <w:pPr>
               <w:cnfStyle w:val="000000010000" w:firstRow="0" w:lastRow="0" w:firstColumn="0" w:lastColumn="0" w:oddVBand="0" w:evenVBand="0" w:oddHBand="0" w:evenHBand="1" w:firstRowFirstColumn="0" w:firstRowLastColumn="0" w:lastRowFirstColumn="0" w:lastRowLastColumn="0"/>
             </w:pPr>
+            <w:r>
+              <w:t xml:space="preserve">Nguyễn Bảo </w:t>
+            </w:r>
+            <w:proofErr w:type="gramStart"/>
+            <w:r>
+              <w:t>An</w:t>
+            </w:r>
+            <w:proofErr w:type="gramEnd"/>
+            <w:r>
+              <w:t xml:space="preserve"> (Đã ký)</w:t>
+            </w:r>
           </w:p>
         </w:tc>
       </w:tr>
@@ -1088,7 +1159,7 @@
 </file>
 
 <file path=word/numbering.xml><?xml version="1.0" encoding="utf-8"?>
-<w:numbering xmlns:wpc="http://schemas.microsoft.com/office/word/2010/wordprocessingCanvas" xmlns:cx="http://schemas.microsoft.com/office/drawing/2014/chartex" xmlns:cx1="http://schemas.microsoft.com/office/drawing/2015/9/8/chartex" xmlns:cx2="http://schemas.microsoft.com/office/drawing/2015/10/21/chartex" xmlns:cx3="http://schemas.microsoft.com/office/drawing/2016/5/9/chartex" xmlns:cx4="http://schemas.microsoft.com/office/drawing/2016/5/10/chartex" xmlns:cx5="http://schemas.microsoft.com/office/drawing/2016/5/11/chartex" xmlns:cx6="http://schemas.microsoft.com/office/drawing/2016/5/12/chartex" xmlns:cx7="http://schemas.microsoft.com/office/drawing/2016/5/13/chartex" xmlns:cx8="http://schemas.microsoft.com/office/drawing/2016/5/14/chartex" xmlns:mc="http://schemas.openxmlformats.org/markup-compatibility/2006" xmlns:aink="http://schemas.microsoft.com/office/drawing/2016/ink" xmlns:am3d="http://schemas.microsoft.com/office/drawing/2017/model3d" xmlns:o="urn:schemas-microsoft-com:office:office" xmlns:oel="http://schemas.microsoft.com/office/2019/extlst" xmlns:r="http://schemas.openxmlformats.org/officeDocument/2006/relationships" xmlns:m="http://schemas.openxmlformats.org/officeDocument/2006/math" xmlns:v="urn:schemas-microsoft-com:vml" xmlns:wp14="http://schemas.microsoft.com/office/word/2010/wordprocessingDrawing" xmlns:wp="http://schemas.openxmlformats.org/drawingml/2006/wordprocessingDrawing" xmlns:w10="urn:schemas-microsoft-com:office:word" xmlns:w="http://schemas.openxmlformats.org/wordprocessingml/2006/main" xmlns:w14="http://schemas.microsoft.com/office/word/2010/wordml" xmlns:w15="http://schemas.microsoft.com/office/word/2012/wordml" xmlns:w16cex="http://schemas.microsoft.com/office/word/2018/wordml/cex" xmlns:w16cid="http://schemas.microsoft.com/office/word/2016/wordml/cid" xmlns:w16="http://schemas.microsoft.com/office/word/2018/wordml" xmlns:w16du="http://schemas.microsoft.com/office/word/2023/wordml/word16du" xmlns:w16sdtdh="http://schemas.microsoft.com/office/word/2020/wordml/sdtdatahash" xmlns:w16sdtfl="http://schemas.microsoft.com/office/word/2024/wordml/sdtformatlock" xmlns:w16se="http://schemas.microsoft.com/office/word/2015/wordml/symex" xmlns:wpg="http://schemas.microsoft.com/office/word/2010/wordprocessingGroup" xmlns:wpi="http://schemas.microsoft.com/office/word/2010/wordprocessingInk" xmlns:wne="http://schemas.microsoft.com/office/word/2006/wordml" xmlns:wps="http://schemas.microsoft.com/office/word/2010/wordprocessingShape" mc:Ignorable="w14 w15 w16se w16cid w16 w16cex w16sdtdh w16sdtfl w16du wp14">
+<w:numbering xmlns:wpc="http://schemas.microsoft.com/office/word/2010/wordprocessingCanvas" xmlns:cx="http://schemas.microsoft.com/office/drawing/2014/chartex" xmlns:cx1="http://schemas.microsoft.com/office/drawing/2015/9/8/chartex" xmlns:cx2="http://schemas.microsoft.com/office/drawing/2015/10/21/chartex" xmlns:cx3="http://schemas.microsoft.com/office/drawing/2016/5/9/chartex" xmlns:cx4="http://schemas.microsoft.com/office/drawing/2016/5/10/chartex" xmlns:cx5="http://schemas.microsoft.com/office/drawing/2016/5/11/chartex" xmlns:cx6="http://schemas.microsoft.com/office/drawing/2016/5/12/chartex" xmlns:cx7="http://schemas.microsoft.com/office/drawing/2016/5/13/chartex" xmlns:cx8="http://schemas.microsoft.com/office/drawing/2016/5/14/chartex" xmlns:mc="http://schemas.openxmlformats.org/markup-compatibility/2006" xmlns:m="http://schemas.openxmlformats.org/officeDocument/2006/math" xmlns:aink="http://schemas.microsoft.com/office/drawing/2016/ink" xmlns:am3d="http://schemas.microsoft.com/office/drawing/2017/model3d" xmlns:oel="http://schemas.microsoft.com/office/2019/extlst" xmlns:r="http://schemas.openxmlformats.org/officeDocument/2006/relationships" xmlns:wp14="http://schemas.microsoft.com/office/word/2010/wordprocessingDrawing" xmlns:wp="http://schemas.openxmlformats.org/drawingml/2006/wordprocessingDrawing" xmlns:wpg="http://schemas.microsoft.com/office/word/2010/wordprocessingGroup" xmlns:wpi="http://schemas.microsoft.com/office/word/2010/wordprocessingInk" xmlns:wps="http://schemas.microsoft.com/office/word/2010/wordprocessingShape" xmlns:o="urn:schemas-microsoft-com:office:office" xmlns:v="urn:schemas-microsoft-com:vml" xmlns:w10="urn:schemas-microsoft-com:office:word" xmlns:w="http://schemas.openxmlformats.org/wordprocessingml/2006/main" xmlns:w14="http://schemas.microsoft.com/office/word/2010/wordml" xmlns:w15="http://schemas.microsoft.com/office/word/2012/wordml" xmlns:w16cex="http://schemas.microsoft.com/office/word/2018/wordml/cex" xmlns:w16cid="http://schemas.microsoft.com/office/word/2016/wordml/cid" xmlns:w16="http://schemas.microsoft.com/office/word/2018/wordml" xmlns:w16sdtdh="http://schemas.microsoft.com/office/word/2020/wordml/sdtdatahash" xmlns:w16sdtfl="http://schemas.microsoft.com/office/word/2024/wordml/sdtformatlock" xmlns:w16se="http://schemas.microsoft.com/office/word/2015/wordml/symex" xmlns:w16du="http://schemas.microsoft.com/office/word/2023/wordml/word16du" xmlns:wne="http://schemas.microsoft.com/office/word/2006/wordml" mc:Ignorable="w14 w15 w16se w16cid w16 w16cex w16sdtdh w16sdtfl w16du wp14">
   <w:abstractNum w:abstractNumId="0" w15:restartNumberingAfterBreak="0">
     <w:nsid w:val="FFFFFF7C"/>
     <w:multiLevelType w:val="singleLevel"/>
@@ -1291,7 +1362,7 @@
 </file>
 
 <file path=word/styles.xml><?xml version="1.0" encoding="utf-8"?>
-<w:styles xmlns:mc="http://schemas.openxmlformats.org/markup-compatibility/2006" xmlns:r="http://schemas.openxmlformats.org/officeDocument/2006/relationships" xmlns:w="http://schemas.openxmlformats.org/wordprocessingml/2006/main" xmlns:w14="http://schemas.microsoft.com/office/word/2010/wordml" xmlns:w15="http://schemas.microsoft.com/office/word/2012/wordml" xmlns:w16cex="http://schemas.microsoft.com/office/word/2018/wordml/cex" xmlns:w16cid="http://schemas.microsoft.com/office/word/2016/wordml/cid" xmlns:w16="http://schemas.microsoft.com/office/word/2018/wordml" xmlns:w16du="http://schemas.microsoft.com/office/word/2023/wordml/word16du" xmlns:w16sdtdh="http://schemas.microsoft.com/office/word/2020/wordml/sdtdatahash" xmlns:w16sdtfl="http://schemas.microsoft.com/office/word/2024/wordml/sdtformatlock" xmlns:w16se="http://schemas.microsoft.com/office/word/2015/wordml/symex" mc:Ignorable="w14 w15 w16se w16cid w16 w16cex w16sdtdh w16sdtfl w16du">
+<w:styles xmlns:mc="http://schemas.openxmlformats.org/markup-compatibility/2006" xmlns:r="http://schemas.openxmlformats.org/officeDocument/2006/relationships" xmlns:w="http://schemas.openxmlformats.org/wordprocessingml/2006/main" xmlns:w14="http://schemas.microsoft.com/office/word/2010/wordml" xmlns:w15="http://schemas.microsoft.com/office/word/2012/wordml" xmlns:w16cex="http://schemas.microsoft.com/office/word/2018/wordml/cex" xmlns:w16cid="http://schemas.microsoft.com/office/word/2016/wordml/cid" xmlns:w16="http://schemas.microsoft.com/office/word/2018/wordml" xmlns:w16sdtdh="http://schemas.microsoft.com/office/word/2020/wordml/sdtdatahash" xmlns:w16sdtfl="http://schemas.microsoft.com/office/word/2024/wordml/sdtformatlock" xmlns:w16se="http://schemas.microsoft.com/office/word/2015/wordml/symex" xmlns:w16du="http://schemas.microsoft.com/office/word/2023/wordml/word16du" mc:Ignorable="w14 w15 w16se w16cid w16 w16cex w16sdtdh w16sdtfl w16du">
   <w:docDefaults>
     <w:rPrDefault>
       <w:rPr>

</xml_diff>